<commit_message>
Align UC02, UC04 and UC05 with original case
</commit_message>
<xml_diff>
--- a/Documentation/Architecture/uml/Timaflu Use Case Beschrijvingen.docx
+++ b/Documentation/Architecture/uml/Timaflu Use Case Beschrijvingen.docx
@@ -1699,8 +1699,7 @@
         <w:pStyle w:val="ListParagraph"/>
       </w:pPr>
       <w:r>
-        <w:lastRenderedPageBreak/>
-        <w:t>The purchasing employee reorders a product. The system selects the cheapest manufacturer and sends the order. If the order is rejected, the system tries the next cheapest manufacturer.</w:t>
+        <w:t>The purchasing employee checks the products below minimum stock, selects the cheapest manufacturer and contacts that manufacturer to place a purchase order. If the manufacturer cannot deliver, the employee contacts the next cheapest one. Only a confirmed order is recorded in the system.</w:t>
       </w:r>
     </w:p>
     <w:p>
@@ -1827,7 +1826,7 @@
         <w:pStyle w:val="ListParagraph"/>
       </w:pPr>
       <w:r>
-        <w:t>No manufacturer accepts the order: the system reports this and removes the product from the internal order list.</w:t>
+        <w:t>If no manufacturer can deliver, the purchasing employee removes the product from the internal reorder list and informs the team. The system does not contact manufacturers automatically.</w:t>
       </w:r>
     </w:p>
     <w:p>
@@ -1850,7 +1849,7 @@
         <w:pStyle w:val="ListParagraph"/>
       </w:pPr>
       <w:r>
-        <w:t>A purchase order has been registered with a manufacturer, or the product has been removed from the internal order list.</w:t>
+        <w:t>A manually confirmed purchase order is recorded, or the purchasing employee notes that no manufacturer can deliver.</w:t>
       </w:r>
     </w:p>
     <w:p>
@@ -2123,7 +2122,7 @@
         <w:pStyle w:val="ListParagraph"/>
       </w:pPr>
       <w:r>
-        <w:t>An employee looks up a product and sees the available stock and locations. If there is not enough stock, a backorder is registered.</w:t>
+        <w:t>The sales employee searches for a medicine and compares the requested quantity with physically available stock minus stock reserved for existing customer orders. If there is a shortage, the employee is informed. Any backorder is handled in the subsequent order-entry process.</w:t>
       </w:r>
     </w:p>
     <w:p>
@@ -2250,7 +2249,7 @@
         <w:pStyle w:val="ListParagraph"/>
       </w:pPr>
       <w:r>
-        <w:t>Product not found: the system shows a message. Requested quantity exceeds available stock: a backorder is registered.</w:t>
+        <w:t>Product not found: the system shows a message. Requested quantity exceeds available stock: the employee receives a shortage warning; no unconfirmed customer order is stored.</w:t>
       </w:r>
     </w:p>
     <w:p>
@@ -2273,7 +2272,7 @@
         <w:pStyle w:val="ListParagraph"/>
       </w:pPr>
       <w:r>
-        <w:t>The available stock and locations have been shown, and a backorder may have been registered.</w:t>
+        <w:t>The physical stock, reserved quantity and available stock are shown. The availability check does not itself create orders or reservations.</w:t>
       </w:r>
     </w:p>
     <w:p>
@@ -2490,7 +2489,7 @@
         <w:pStyle w:val="ListParagraph"/>
       </w:pPr>
       <w:r>
-        <w:t>The order has been saved with an order number, reserved stock and a delivery time, or the order has been cancelled.</w:t>
+        <w:t>After customer approval and a transaction-safe final stock check, the order and its order lines are saved, available items are reserved, and a delivery date and part of day are recorded. If the customer declines, no reservation is created.</w:t>
       </w:r>
     </w:p>
     <w:p>

</xml_diff>